<commit_message>
Quita la etiqueta 'propuesto' del informe de indicadores TRD/Gap/RBE
Co-Authored-By: Claude Opus 5.5 <noreply@anthropic.com>
Claude-Session: https://claude.ai/code/session_01Qn5ehQDHTMzA5kxyjymjpl
</commit_message>
<xml_diff>
--- a/Indicadores_Robustez_TRD_Gap_RBE.docx
+++ b/Indicadores_Robustez_TRD_Gap_RBE.docx
@@ -377,7 +377,7 @@
                 <w:b w:val="false"/>
                 <w:bCs w:val="false"/>
               </w:rPr>
-              <w:t xml:space="preserve">ViT-Base/16 + DA (x2) — propuesto</w:t>
+              <w:t xml:space="preserve">ViT-Base/16 + DA (x2)</w:t>
             </w:r>
           </w:p>
         </w:tc>
@@ -464,7 +464,7 @@
           <w:sz w:val="19"/>
           <w:szCs w:val="19"/>
         </w:rPr>
-        <w:t xml:space="preserve">DA = augmentación de datos (x2: cada imagen de entrenamiento aparece 2 veces por época, con una transformación aleatoria independiente). El resultado "CNN — mejor resultado" y "ViT + DA — propuesto" usan ambos la variante con x2 (la mejor de cada arquitectura); la fila "ViT-Base/16 — sin augmentación" es la misma arquitectura sin x2, para aislar el efecto de la augmentación.</w:t>
+        <w:t xml:space="preserve">DA = augmentación de datos (x2: cada imagen de entrenamiento aparece 2 veces por época, con una transformación aleatoria independiente). El resultado "CNN — mejor resultado" y "ViT + DA" usan ambos la variante con x2 (la mejor de cada arquitectura); la fila "ViT-Base/16 — sin augmentación" es la misma arquitectura sin x2, para aislar el efecto de la augmentación.</w:t>
       </w:r>
     </w:p>
     <w:p>
@@ -972,7 +972,7 @@
         <w:spacing w:after="90" w:before="180"/>
       </w:pPr>
       <w:r>
-        <w:t xml:space="preserve">2.3. ViT-Base/16 + DA (x2) — propuesto</w:t>
+        <w:t xml:space="preserve">2.3. ViT-Base/16 + DA (x2)</w:t>
       </w:r>
     </w:p>
     <w:p>
@@ -1573,7 +1573,7 @@
                 <w:b w:val="false"/>
                 <w:bCs w:val="false"/>
               </w:rPr>
-              <w:t xml:space="preserve">ViT-Base/16 + DA (propuesto)</w:t>
+              <w:t xml:space="preserve">ViT-Base/16 + DA</w:t>
             </w:r>
           </w:p>
         </w:tc>
@@ -1965,7 +1965,7 @@
         <w:spacing w:after="90" w:before="180"/>
       </w:pPr>
       <w:r>
-        <w:t xml:space="preserve">3.3. ViT-Base/16 + DA (x2) — propuesto</w:t>
+        <w:t xml:space="preserve">3.3. ViT-Base/16 + DA (x2)</w:t>
       </w:r>
     </w:p>
     <w:p>
@@ -2589,7 +2589,7 @@
                 <w:b w:val="false"/>
                 <w:bCs w:val="false"/>
               </w:rPr>
-              <w:t xml:space="preserve">ViT-Base/16 + DA (propuesto)</w:t>
+              <w:t xml:space="preserve">ViT-Base/16 + DA</w:t>
             </w:r>
           </w:p>
         </w:tc>
@@ -3372,7 +3372,7 @@
                 <w:b w:val="false"/>
                 <w:bCs w:val="false"/>
               </w:rPr>
-              <w:t xml:space="preserve">ViT-Base/16 + DA (propuesto)</w:t>
+              <w:t xml:space="preserve">ViT-Base/16 + DA</w:t>
             </w:r>
           </w:p>
         </w:tc>
@@ -3498,7 +3498,7 @@
         <w:spacing w:after="100"/>
       </w:pPr>
       <w:r>
-        <w:t xml:space="preserve">El promedio para el modelo propuesto: RBE_promedio = (18.15 + 35.68) / 2 = 26.92%.</w:t>
+        <w:t xml:space="preserve">El promedio para ViT-Base/16 + DA: RBE_promedio = (18.15 + 35.68) / 2 = 26.92%.</w:t>
       </w:r>
     </w:p>
     <w:p>
@@ -4263,7 +4263,7 @@
                 <w:b w:val="false"/>
                 <w:bCs w:val="false"/>
               </w:rPr>
-              <w:t xml:space="preserve">ViT-Base/16 + DA (propuesto)</w:t>
+              <w:t xml:space="preserve">ViT-Base/16 + DA</w:t>
             </w:r>
           </w:p>
         </w:tc>

</xml_diff>

<commit_message>
Informe de indicadores: usa los nombres Trucha y Rohu en lugar de T1/T2
Co-Authored-By: Claude Opus 5.5 <noreply@anthropic.com>
Claude-Session: https://claude.ai/code/session_01Qn5ehQDHTMzA5kxyjymjpl
</commit_message>
<xml_diff>
--- a/Indicadores_Robustez_TRD_Gap_RBE.docx
+++ b/Indicadores_Robustez_TRD_Gap_RBE.docx
@@ -70,7 +70,7 @@
           <w:sz w:val="22"/>
           <w:szCs w:val="22"/>
         </w:rPr>
-        <w:t xml:space="preserve">El dominio fuente es Mendeley Data (Prasetyo et al., 2022a; 8,000 imágenes). Se evalúan dos dominios objetivo independientes: Target 1 = OneDrive–Trucha (Perú, 1,150 imágenes) y Target 2 = Rohu. Todos los valores son F1-Score macro expresados en escala 0–1, tomados de los CSV del repositorio (no simulados).</w:t>
+        <w:t xml:space="preserve">El dominio fuente es Mendeley Data (Prasetyo et al., 2022a; 8,000 imágenes). Se evalúan dos dominios objetivo independientes: Trucha (OneDrive, Perú; 1,150 imágenes) y Rohu (1,261 imágenes). Todos los valores son F1-Score macro expresados en escala 0–1, tomados de los CSV del repositorio (no simulados).</w:t>
       </w:r>
     </w:p>
     <w:p>
@@ -206,7 +206,7 @@
                 <w:sz w:val="18"/>
                 <w:szCs w:val="18"/>
               </w:rPr>
-              <w:t xml:space="preserve">F1 Target 1: Trucha</w:t>
+              <w:t xml:space="preserve">F1 Trucha</w:t>
             </w:r>
           </w:p>
         </w:tc>
@@ -240,7 +240,7 @@
                 <w:sz w:val="18"/>
                 <w:szCs w:val="18"/>
               </w:rPr>
-              <w:t xml:space="preserve">F1 Target 2: Rohu</w:t>
+              <w:t xml:space="preserve">F1 Rohu</w:t>
             </w:r>
           </w:p>
         </w:tc>
@@ -980,7 +980,7 @@
           <w:sz w:val="22"/>
           <w:szCs w:val="22"/>
         </w:rPr>
-        <w:t xml:space="preserve">Donde F1_Source es el F1 macro en Mendeley y F1_Targetⱼ el F1 macro en el dominio objetivo j (j = 1: Trucha; j = 2: Rohu). Una tasa cercana a 100 % indica poca degradación.</w:t>
+        <w:t xml:space="preserve">Donde F1_Source es el F1 macro en Mendeley y F1_Targetⱼ el F1 macro en el dominio objetivo j (j = Trucha o Rohu). Una tasa cercana a 100 % indica poca degradación.</w:t>
       </w:r>
     </w:p>
     <w:p>
@@ -1006,7 +1006,7 @@
           <w:sz w:val="22"/>
           <w:szCs w:val="22"/>
         </w:rPr>
-        <w:t xml:space="preserve">TRD_T1 = (0.8088 / 0.9566) × 100 = 84.55 %</w:t>
+        <w:t xml:space="preserve">TRD_Trucha = (0.8088 / 0.9566) × 100 = 84.55 %</w:t>
       </w:r>
     </w:p>
     <w:p>
@@ -1020,7 +1020,7 @@
           <w:sz w:val="22"/>
           <w:szCs w:val="22"/>
         </w:rPr>
-        <w:t xml:space="preserve">TRD_T2 = (0.8285 / 0.9566) × 100 = 86.61 %</w:t>
+        <w:t xml:space="preserve">TRD_Rohu = (0.8285 / 0.9566) × 100 = 86.61 %</w:t>
       </w:r>
     </w:p>
     <w:p>
@@ -1059,7 +1059,7 @@
           <w:sz w:val="22"/>
           <w:szCs w:val="22"/>
         </w:rPr>
-        <w:t xml:space="preserve">TRD_T1 = (0.8611 / 0.9696) × 100 = 88.81 %</w:t>
+        <w:t xml:space="preserve">TRD_Trucha = (0.8611 / 0.9696) × 100 = 88.81 %</w:t>
       </w:r>
     </w:p>
     <w:p>
@@ -1073,7 +1073,7 @@
           <w:sz w:val="22"/>
           <w:szCs w:val="22"/>
         </w:rPr>
-        <w:t xml:space="preserve">TRD_T2 = (0.8817 / 0.9696) × 100 = 90.93 %</w:t>
+        <w:t xml:space="preserve">TRD_Rohu = (0.8817 / 0.9696) × 100 = 90.93 %</w:t>
       </w:r>
     </w:p>
     <w:p>
@@ -1224,7 +1224,7 @@
                 <w:sz w:val="18"/>
                 <w:szCs w:val="18"/>
               </w:rPr>
-              <w:t xml:space="preserve">F1 T1</w:t>
+              <w:t xml:space="preserve">F1 Trucha</w:t>
             </w:r>
           </w:p>
         </w:tc>
@@ -1258,7 +1258,7 @@
                 <w:sz w:val="18"/>
                 <w:szCs w:val="18"/>
               </w:rPr>
-              <w:t xml:space="preserve">F1 T2</w:t>
+              <w:t xml:space="preserve">F1 Rohu</w:t>
             </w:r>
           </w:p>
         </w:tc>
@@ -1292,7 +1292,7 @@
                 <w:sz w:val="18"/>
                 <w:szCs w:val="18"/>
               </w:rPr>
-              <w:t xml:space="preserve">TRD T1 (%)</w:t>
+              <w:t xml:space="preserve">TRD Trucha (%)</w:t>
             </w:r>
           </w:p>
         </w:tc>
@@ -1326,7 +1326,7 @@
                 <w:sz w:val="18"/>
                 <w:szCs w:val="18"/>
               </w:rPr>
-              <w:t xml:space="preserve">TRD T2 (%)</w:t>
+              <w:t xml:space="preserve">TRD Rohu (%)</w:t>
             </w:r>
           </w:p>
         </w:tc>
@@ -1800,7 +1800,7 @@
           <w:sz w:val="22"/>
           <w:szCs w:val="22"/>
         </w:rPr>
-        <w:t xml:space="preserve">TRD promedio = (TRD_T1 + TRD_T2) / 2. Por ejemplo, para ViT-Base/16:</w:t>
+        <w:t xml:space="preserve">TRD promedio = (TRD_Trucha + TRD_Rohu) / 2. Por ejemplo, para ViT-Base/16:</w:t>
       </w:r>
     </w:p>
     <w:p>
@@ -1920,7 +1920,7 @@
           <w:sz w:val="22"/>
           <w:szCs w:val="22"/>
         </w:rPr>
-        <w:t xml:space="preserve">Error_T1 = 1 − 0.8088 = 0.1912   →   Gap_T1 = 0.1912 − 0.0434 = 0.1478</w:t>
+        <w:t xml:space="preserve">Error_Trucha = 1 − 0.8088 = 0.1912   →   Gap_Trucha = 0.1912 − 0.0434 = 0.1478</w:t>
       </w:r>
     </w:p>
     <w:p>
@@ -1934,7 +1934,7 @@
           <w:sz w:val="22"/>
           <w:szCs w:val="22"/>
         </w:rPr>
-        <w:t xml:space="preserve">Error_T2 = 1 − 0.8285 = 0.1715   →   Gap_T2 = 0.1715 − 0.0434 = 0.1281</w:t>
+        <w:t xml:space="preserve">Error_Rohu = 1 − 0.8285 = 0.1715   →   Gap_Rohu = 0.1715 − 0.0434 = 0.1281</w:t>
       </w:r>
     </w:p>
     <w:p>
@@ -1974,7 +1974,7 @@
           <w:sz w:val="22"/>
           <w:szCs w:val="22"/>
         </w:rPr>
-        <w:t xml:space="preserve">Error_T1 = 1 − 0.8611 = 0.1389   →   Gap_T1 = 0.1389 − 0.0304 = 0.1085</w:t>
+        <w:t xml:space="preserve">Error_Trucha = 1 − 0.8611 = 0.1389   →   Gap_Trucha = 0.1389 − 0.0304 = 0.1085</w:t>
       </w:r>
     </w:p>
     <w:p>
@@ -1988,7 +1988,7 @@
           <w:sz w:val="22"/>
           <w:szCs w:val="22"/>
         </w:rPr>
-        <w:t xml:space="preserve">Error_T2 = 1 − 0.8817 = 0.1183   →   Gap_T2 = 0.1183 − 0.0304 = 0.0879</w:t>
+        <w:t xml:space="preserve">Error_Rohu = 1 − 0.8817 = 0.1183   →   Gap_Rohu = 0.1183 − 0.0304 = 0.0879</w:t>
       </w:r>
     </w:p>
     <w:p>
@@ -2126,7 +2126,7 @@
                 <w:sz w:val="18"/>
                 <w:szCs w:val="18"/>
               </w:rPr>
-              <w:t xml:space="preserve">Error T1</w:t>
+              <w:t xml:space="preserve">Error Trucha</w:t>
             </w:r>
           </w:p>
         </w:tc>
@@ -2160,7 +2160,7 @@
                 <w:sz w:val="18"/>
                 <w:szCs w:val="18"/>
               </w:rPr>
-              <w:t xml:space="preserve">Error T2</w:t>
+              <w:t xml:space="preserve">Error Rohu</w:t>
             </w:r>
           </w:p>
         </w:tc>
@@ -2194,7 +2194,7 @@
                 <w:sz w:val="18"/>
                 <w:szCs w:val="18"/>
               </w:rPr>
-              <w:t xml:space="preserve">Gap T1</w:t>
+              <w:t xml:space="preserve">Gap Trucha</w:t>
             </w:r>
           </w:p>
         </w:tc>
@@ -2228,7 +2228,7 @@
                 <w:sz w:val="18"/>
                 <w:szCs w:val="18"/>
               </w:rPr>
-              <w:t xml:space="preserve">Gap T2</w:t>
+              <w:t xml:space="preserve">Gap Rohu</w:t>
             </w:r>
           </w:p>
         </w:tc>
@@ -2754,7 +2754,7 @@
           <w:sz w:val="22"/>
           <w:szCs w:val="22"/>
         </w:rPr>
-        <w:t xml:space="preserve">RBE_T1 = (0.1478 − 0.1085) / 0.1478 × 100 = 26.59 %</w:t>
+        <w:t xml:space="preserve">RBE_Trucha = (0.1478 − 0.1085) / 0.1478 × 100 = 26.59 %</w:t>
       </w:r>
     </w:p>
     <w:p>
@@ -2768,7 +2768,7 @@
           <w:sz w:val="22"/>
           <w:szCs w:val="22"/>
         </w:rPr>
-        <w:t xml:space="preserve">RBE_T2 = (0.1281 − 0.0879) / 0.1281 × 100 = 31.38 %</w:t>
+        <w:t xml:space="preserve">RBE_Rohu = (0.1281 − 0.0879) / 0.1281 × 100 = 31.38 %</w:t>
       </w:r>
     </w:p>
     <w:p>
@@ -2871,7 +2871,7 @@
                 <w:sz w:val="18"/>
                 <w:szCs w:val="18"/>
               </w:rPr>
-              <w:t xml:space="preserve">Gap T1</w:t>
+              <w:t xml:space="preserve">Gap Trucha</w:t>
             </w:r>
           </w:p>
         </w:tc>
@@ -2905,7 +2905,7 @@
                 <w:sz w:val="18"/>
                 <w:szCs w:val="18"/>
               </w:rPr>
-              <w:t xml:space="preserve">Gap T2</w:t>
+              <w:t xml:space="preserve">Gap Rohu</w:t>
             </w:r>
           </w:p>
         </w:tc>
@@ -2939,7 +2939,7 @@
                 <w:sz w:val="18"/>
                 <w:szCs w:val="18"/>
               </w:rPr>
-              <w:t xml:space="preserve">RBE T1 (%)</w:t>
+              <w:t xml:space="preserve">RBE Trucha (%)</w:t>
             </w:r>
           </w:p>
         </w:tc>
@@ -2973,7 +2973,7 @@
                 <w:sz w:val="18"/>
                 <w:szCs w:val="18"/>
               </w:rPr>
-              <w:t xml:space="preserve">RBE T2 (%)</w:t>
+              <w:t xml:space="preserve">RBE Rohu (%)</w:t>
             </w:r>
           </w:p>
         </w:tc>
@@ -3515,7 +3515,7 @@
                 <w:sz w:val="18"/>
                 <w:szCs w:val="18"/>
               </w:rPr>
-              <w:t xml:space="preserve">F1 T1</w:t>
+              <w:t xml:space="preserve">F1 Trucha</w:t>
             </w:r>
           </w:p>
         </w:tc>
@@ -3549,7 +3549,7 @@
                 <w:sz w:val="18"/>
                 <w:szCs w:val="18"/>
               </w:rPr>
-              <w:t xml:space="preserve">F1 T2</w:t>
+              <w:t xml:space="preserve">F1 Rohu</w:t>
             </w:r>
           </w:p>
         </w:tc>
@@ -3583,7 +3583,7 @@
                 <w:sz w:val="18"/>
                 <w:szCs w:val="18"/>
               </w:rPr>
-              <w:t xml:space="preserve">TRD T1 %</w:t>
+              <w:t xml:space="preserve">TRD Trucha %</w:t>
             </w:r>
           </w:p>
         </w:tc>
@@ -3617,7 +3617,7 @@
                 <w:sz w:val="18"/>
                 <w:szCs w:val="18"/>
               </w:rPr>
-              <w:t xml:space="preserve">TRD T2 %</w:t>
+              <w:t xml:space="preserve">TRD Rohu %</w:t>
             </w:r>
           </w:p>
         </w:tc>
@@ -3651,7 +3651,7 @@
                 <w:sz w:val="18"/>
                 <w:szCs w:val="18"/>
               </w:rPr>
-              <w:t xml:space="preserve">Gap T1</w:t>
+              <w:t xml:space="preserve">Gap Trucha</w:t>
             </w:r>
           </w:p>
         </w:tc>
@@ -3685,7 +3685,7 @@
                 <w:sz w:val="18"/>
                 <w:szCs w:val="18"/>
               </w:rPr>
-              <w:t xml:space="preserve">Gap T2</w:t>
+              <w:t xml:space="preserve">Gap Rohu</w:t>
             </w:r>
           </w:p>
         </w:tc>
@@ -3719,7 +3719,7 @@
                 <w:sz w:val="18"/>
                 <w:szCs w:val="18"/>
               </w:rPr>
-              <w:t xml:space="preserve">RBE T1 %</w:t>
+              <w:t xml:space="preserve">RBE Trucha %</w:t>
             </w:r>
           </w:p>
         </w:tc>
@@ -3753,7 +3753,7 @@
                 <w:sz w:val="18"/>
                 <w:szCs w:val="18"/>
               </w:rPr>
-              <w:t xml:space="preserve">RBE T2 %</w:t>
+              <w:t xml:space="preserve">RBE Rohu %</w:t>
             </w:r>
           </w:p>
         </w:tc>
@@ -4544,7 +4544,7 @@
           <w:sz w:val="22"/>
           <w:szCs w:val="22"/>
         </w:rPr>
-        <w:t xml:space="preserve">Target 2 es el dataset combinado 70 % Trucha / 30 % Rohu (1,261 imágenes: 805 Trucha + 456 Rohu de Kaggle), no Rohu puro, porque Rohu puro tiene un atajo de fecha/sesión documentado que infla el F1 a ~99–100 %.</w:t>
+        <w:t xml:space="preserve">El dominio Rohu es el dataset combinado 70 % Trucha / 30 % Rohu (1,261 imágenes: 805 Trucha + 456 Rohu de Kaggle), no Rohu puro, porque Rohu puro tiene un atajo de fecha/sesión documentado que infla el F1 a ~99–100 %.</w:t>
       </w:r>
     </w:p>
     <w:p>

</xml_diff>

<commit_message>
Pasa la documentacion del linear probe a 10 folds: todas las cifras (tablas, matrices por fold y pooled, ROC, val_F1 por epoch, TRD/Gap/RBE) salen de la corrida de 10 folds (linear_probe_con_test.py --protocolo original --folds 10), con Wilcoxon pareado ViT vs DenseNet; verificacion_10fold renombrada a linear_probe_10fold con predicciones, matrices y ROC; Resultados, Indicadores y README actualizados
Co-Authored-By: Claude Opus 5.5 <noreply@anthropic.com>
Claude-Session: https://claude.ai/code/session_01H57NiR1mJmA9jsiQrmrPSF
</commit_message>
<xml_diff>
--- a/Indicadores_Robustez_TRD_Gap_RBE.docx
+++ b/Indicadores_Robustez_TRD_Gap_RBE.docx
@@ -15,7 +15,7 @@
           <w:sz w:val="34"/>
           <w:szCs w:val="34"/>
         </w:rPr>
-        <w:t xml:space="preserve">Indicadores de Robustez ante el Cambio de Dominio</w:t>
+        <w:t>Indicadores de Robustez ante el Cambio de Dominio</w:t>
       </w:r>
     </w:p>
     <w:p>
@@ -30,7 +30,7 @@
           <w:sz w:val="22"/>
           <w:szCs w:val="22"/>
         </w:rPr>
-        <w:t xml:space="preserve">Tasa de Retención (TRD), Brecha de Error (Gap) y Reducción de Brecha (RBE) — ViT-Base/16 vs. DenseNet-121 (linear probe, sin x2)</w:t>
+        <w:t>Tasa de Retención (TRD), Brecha de Error (Gap) y Reducción de Brecha (RBE) — ViT-Base/16 vs. DenseNet-121 (linear probe, sin x2)</w:t>
       </w:r>
     </w:p>
     <w:p>
@@ -45,7 +45,7 @@
           <w:sz w:val="20"/>
           <w:szCs w:val="20"/>
         </w:rPr>
-        <w:t xml:space="preserve">Proyecto Generalizacion_ViT_DenseNet · Miguel Sumaran · 5 de octubre de 2026</w:t>
+        <w:t>Proyecto Generalizacion_ViT_DenseNet · Miguel Sumaran · 27 de octubre de 2026</w:t>
       </w:r>
     </w:p>
     <w:p>
@@ -57,7 +57,7 @@
         <w:rPr>
           <w:rFonts w:ascii="Calibri" w:cs="Calibri" w:eastAsia="Calibri" w:hAnsi="Calibri"/>
         </w:rPr>
-        <w:t xml:space="preserve">0. Datos de partida</w:t>
+        <w:t>0. Datos de partida</w:t>
       </w:r>
     </w:p>
     <w:p>
@@ -70,7 +70,7 @@
           <w:sz w:val="22"/>
           <w:szCs w:val="22"/>
         </w:rPr>
-        <w:t xml:space="preserve">El dominio fuente es Mendeley Data (Prasetyo et al., 2022a; 8,000 imágenes). Se evalúan dos dominios objetivo independientes: Trucha (OneDrive, Perú; 1,150 imágenes) y Rohu (1,261 imágenes). Todos los valores son F1-Score macro expresados en escala 0–1, tomados de los CSV del repositorio (no simulados).</w:t>
+        <w:t>El dominio fuente es Mendeley Data (Prasetyo et al., 2022a; 8,000 imágenes). Se evalúan dos dominios objetivo independientes: Trucha (OneDrive, Perú; 1,150 imágenes) y Rohu (1,261 imágenes). Todos los valores son F1-Score macro expresados en escala 0–1, tomados de los CSV del repositorio (no simulados).</w:t>
       </w:r>
     </w:p>
     <w:p>
@@ -83,7 +83,7 @@
           <w:sz w:val="22"/>
           <w:szCs w:val="22"/>
         </w:rPr>
-        <w:t xml:space="preserve">Se comparan dos modelos, ViT-Base/16 (Transformer) y DenseNet-121 (CNN), ambos con el mismo método: backbone congelado (entrenado en Mendeley) + entrenamiento de la cabeza de clasificación con imágenes del dominio objetivo (linear probe, 30 épocas, sin augmentación x2, validación cruzada de 5 folds).</w:t>
+        <w:t>Se comparan dos modelos, ViT-Base/16 (Transformer) y DenseNet-121 (CNN), ambos con el mismo método: backbone congelado (entrenado en Mendeley) + entrenamiento de la cabeza de clasificación con imágenes del dominio objetivo (linear probe, 30 épocas, sin augmentación x2, validación cruzada de 10 folds).</w:t>
       </w:r>
     </w:p>
     <w:tbl>
@@ -138,7 +138,7 @@
                 <w:sz w:val="18"/>
                 <w:szCs w:val="18"/>
               </w:rPr>
-              <w:t xml:space="preserve">Modelo</w:t>
+              <w:t>Modelo</w:t>
             </w:r>
           </w:p>
         </w:tc>
@@ -172,7 +172,7 @@
                 <w:sz w:val="18"/>
                 <w:szCs w:val="18"/>
               </w:rPr>
-              <w:t xml:space="preserve">F1 Source: Mendeley</w:t>
+              <w:t>F1 Source: Mendeley</w:t>
             </w:r>
           </w:p>
         </w:tc>
@@ -206,7 +206,7 @@
                 <w:sz w:val="18"/>
                 <w:szCs w:val="18"/>
               </w:rPr>
-              <w:t xml:space="preserve">F1 Trucha</w:t>
+              <w:t>F1 Trucha</w:t>
             </w:r>
           </w:p>
         </w:tc>
@@ -240,7 +240,7 @@
                 <w:sz w:val="18"/>
                 <w:szCs w:val="18"/>
               </w:rPr>
-              <w:t xml:space="preserve">F1 Rohu</w:t>
+              <w:t>F1 Rohu</w:t>
             </w:r>
           </w:p>
         </w:tc>
@@ -272,7 +272,7 @@
                 <w:sz w:val="18"/>
                 <w:szCs w:val="18"/>
               </w:rPr>
-              <w:t xml:space="preserve">DenseNet-121 (CNN, baseline)</w:t>
+              <w:t>DenseNet-121 (CNN, baseline)</w:t>
             </w:r>
           </w:p>
         </w:tc>
@@ -302,7 +302,7 @@
                 <w:sz w:val="18"/>
                 <w:szCs w:val="18"/>
               </w:rPr>
-              <w:t xml:space="preserve">0.9566</w:t>
+              <w:t>0.9566</w:t>
             </w:r>
           </w:p>
         </w:tc>
@@ -332,7 +332,7 @@
                 <w:sz w:val="18"/>
                 <w:szCs w:val="18"/>
               </w:rPr>
-              <w:t xml:space="preserve">0.8088</w:t>
+              <w:t>0.8277</w:t>
             </w:r>
           </w:p>
         </w:tc>
@@ -362,7 +362,7 @@
                 <w:sz w:val="18"/>
                 <w:szCs w:val="18"/>
               </w:rPr>
-              <w:t xml:space="preserve">0.8285</w:t>
+              <w:t>0.8416</w:t>
             </w:r>
           </w:p>
         </w:tc>
@@ -394,7 +394,7 @@
                 <w:sz w:val="18"/>
                 <w:szCs w:val="18"/>
               </w:rPr>
-              <w:t xml:space="preserve">ViT-Base/16</w:t>
+              <w:t>ViT-Base/16</w:t>
             </w:r>
           </w:p>
         </w:tc>
@@ -424,7 +424,7 @@
                 <w:sz w:val="18"/>
                 <w:szCs w:val="18"/>
               </w:rPr>
-              <w:t xml:space="preserve">0.9696</w:t>
+              <w:t>0.9696</w:t>
             </w:r>
           </w:p>
         </w:tc>
@@ -454,7 +454,7 @@
                 <w:sz w:val="18"/>
                 <w:szCs w:val="18"/>
               </w:rPr>
-              <w:t xml:space="preserve">0.8611</w:t>
+              <w:t>0.8633</w:t>
             </w:r>
           </w:p>
         </w:tc>
@@ -484,7 +484,7 @@
                 <w:sz w:val="18"/>
                 <w:szCs w:val="18"/>
               </w:rPr>
-              <w:t xml:space="preserve">0.8817</w:t>
+              <w:t>0.9018</w:t>
             </w:r>
           </w:p>
         </w:tc>
@@ -502,7 +502,7 @@
           <w:sz w:val="22"/>
           <w:szCs w:val="22"/>
         </w:rPr>
-        <w:t xml:space="preserve">F1 fuente: F1 macro pooled DNC 5-fold en Mendeley. F1 objetivo: media de los 5 folds. Archivos: 3_resultados/{trucha,rohu}/congelado_sinx2_resumen.csv.</w:t>
+        <w:t>F1 fuente: F1 macro pooled DNC 5-fold en Mendeley. F1 objetivo: media de los 10 folds. Archivos: 3_resultados/{trucha,rohu}/linear_probe_10fold/resumen.csv.</w:t>
       </w:r>
     </w:p>
     <w:p>
@@ -514,7 +514,7 @@
         <w:rPr>
           <w:rFonts w:ascii="Calibri" w:cs="Calibri" w:eastAsia="Calibri" w:hAnsi="Calibri"/>
         </w:rPr>
-        <w:t xml:space="preserve">1. Evaluación in-dataset y cross-dataset</w:t>
+        <w:t>1. Evaluación in-dataset y cross-dataset</w:t>
       </w:r>
     </w:p>
     <w:tbl>
@@ -568,7 +568,7 @@
                 <w:sz w:val="18"/>
                 <w:szCs w:val="18"/>
               </w:rPr>
-              <w:t xml:space="preserve">Tipo de evaluación</w:t>
+              <w:t>Tipo de evaluación</w:t>
             </w:r>
           </w:p>
         </w:tc>
@@ -602,7 +602,7 @@
                 <w:sz w:val="18"/>
                 <w:szCs w:val="18"/>
               </w:rPr>
-              <w:t xml:space="preserve">Entrenamiento</w:t>
+              <w:t>Entrenamiento</w:t>
             </w:r>
           </w:p>
         </w:tc>
@@ -636,7 +636,7 @@
                 <w:sz w:val="18"/>
                 <w:szCs w:val="18"/>
               </w:rPr>
-              <w:t xml:space="preserve">Evaluación</w:t>
+              <w:t>Evaluación</w:t>
             </w:r>
           </w:p>
         </w:tc>
@@ -668,7 +668,7 @@
                 <w:sz w:val="18"/>
                 <w:szCs w:val="18"/>
               </w:rPr>
-              <w:t xml:space="preserve">In-dataset</w:t>
+              <w:t>In-dataset</w:t>
             </w:r>
           </w:p>
         </w:tc>
@@ -698,7 +698,7 @@
                 <w:sz w:val="18"/>
                 <w:szCs w:val="18"/>
               </w:rPr>
-              <w:t xml:space="preserve">Mendeley – entrenamiento (5 folds)</w:t>
+              <w:t>Mendeley – entrenamiento (5 folds)</w:t>
             </w:r>
           </w:p>
         </w:tc>
@@ -728,7 +728,7 @@
                 <w:sz w:val="18"/>
                 <w:szCs w:val="18"/>
               </w:rPr>
-              <w:t xml:space="preserve">Mendeley – validación</w:t>
+              <w:t>Mendeley – validación</w:t>
             </w:r>
           </w:p>
         </w:tc>
@@ -760,7 +760,7 @@
                 <w:sz w:val="18"/>
                 <w:szCs w:val="18"/>
               </w:rPr>
-              <w:t xml:space="preserve">Cross-dataset 1</w:t>
+              <w:t>Cross-dataset 1</w:t>
             </w:r>
           </w:p>
         </w:tc>
@@ -790,7 +790,7 @@
                 <w:sz w:val="18"/>
                 <w:szCs w:val="18"/>
               </w:rPr>
-              <w:t xml:space="preserve">Backbone de Mendeley + cabeza entrenada en Trucha (folds de entrenamiento)</w:t>
+              <w:t>Backbone de Mendeley + cabeza entrenada en Trucha (folds de entrenamiento)</w:t>
             </w:r>
           </w:p>
         </w:tc>
@@ -820,7 +820,7 @@
                 <w:sz w:val="18"/>
                 <w:szCs w:val="18"/>
               </w:rPr>
-              <w:t xml:space="preserve">Trucha – folds de validación</w:t>
+              <w:t>Trucha – folds de validación</w:t>
             </w:r>
           </w:p>
         </w:tc>
@@ -852,7 +852,7 @@
                 <w:sz w:val="18"/>
                 <w:szCs w:val="18"/>
               </w:rPr>
-              <w:t xml:space="preserve">Cross-dataset 2</w:t>
+              <w:t>Cross-dataset 2</w:t>
             </w:r>
           </w:p>
         </w:tc>
@@ -882,7 +882,7 @@
                 <w:sz w:val="18"/>
                 <w:szCs w:val="18"/>
               </w:rPr>
-              <w:t xml:space="preserve">Backbone de Mendeley + cabeza entrenada en Rohu (folds de entrenamiento)</w:t>
+              <w:t>Backbone de Mendeley + cabeza entrenada en Rohu (folds de entrenamiento)</w:t>
             </w:r>
           </w:p>
         </w:tc>
@@ -912,7 +912,7 @@
                 <w:sz w:val="18"/>
                 <w:szCs w:val="18"/>
               </w:rPr>
-              <w:t xml:space="preserve">Rohu – folds de validación</w:t>
+              <w:t>Rohu – folds de validación</w:t>
             </w:r>
           </w:p>
         </w:tc>
@@ -928,7 +928,7 @@
           <w:sz w:val="22"/>
           <w:szCs w:val="22"/>
         </w:rPr>
-        <w:t xml:space="preserve">Cada fold del dominio objetivo parte del checkpoint de Mendeley del mismo índice (fold i → fold i); el backbone permanece congelado y solo se ajusta la cabeza de clasificación. Trucha y Rohu se evalúan por separado.</w:t>
+        <w:t>Cada fold del dominio objetivo parte del checkpoint de Mendeley del fold ((k − 1) mod 5) + 1, porque Mendeley tiene 5 checkpoints por modelo; el backbone permanece congelado y solo se ajusta la cabeza de clasificación. Trucha y Rohu se evalúan por separado.</w:t>
       </w:r>
     </w:p>
     <w:p>
@@ -940,7 +940,7 @@
         <w:rPr>
           <w:rFonts w:ascii="Calibri" w:cs="Calibri" w:eastAsia="Calibri" w:hAnsi="Calibri"/>
         </w:rPr>
-        <w:t xml:space="preserve">2. Tasa de Retención del Desempeño (TRD)</w:t>
+        <w:t>2. Tasa de Retención del Desempeño (TRD)</w:t>
       </w:r>
     </w:p>
     <w:p>
@@ -953,7 +953,7 @@
           <w:sz w:val="22"/>
           <w:szCs w:val="22"/>
         </w:rPr>
-        <w:t xml:space="preserve">La TRD indica qué porcentaje del desempeño obtenido en Mendeley conserva el modelo al evaluarse en otro dominio:</w:t>
+        <w:t>La TRD indica qué porcentaje del desempeño obtenido en Mendeley conserva el modelo al evaluarse en otro dominio:</w:t>
       </w:r>
     </w:p>
     <w:p>
@@ -967,7 +967,7 @@
           <w:sz w:val="22"/>
           <w:szCs w:val="22"/>
         </w:rPr>
-        <w:t xml:space="preserve">TRDⱼ = (F1_Targetⱼ / F1_Source) × 100</w:t>
+        <w:t>TRDⱼ = (F1_Targetⱼ / F1_Source) × 100</w:t>
       </w:r>
     </w:p>
     <w:p>
@@ -980,7 +980,7 @@
           <w:sz w:val="22"/>
           <w:szCs w:val="22"/>
         </w:rPr>
-        <w:t xml:space="preserve">Donde F1_Source es el F1 macro en Mendeley y F1_Targetⱼ el F1 macro en el dominio objetivo j (j = Trucha o Rohu). Una tasa cercana a 100 % indica poca degradación.</w:t>
+        <w:t>Donde F1_Source es el F1 macro en Mendeley y F1_Targetⱼ el F1 macro en el dominio objetivo j (j = Trucha o Rohu). Una tasa cercana a 100 % indica poca degradación.</w:t>
       </w:r>
     </w:p>
     <w:p>
@@ -992,7 +992,7 @@
         <w:rPr>
           <w:rFonts w:ascii="Calibri" w:cs="Calibri" w:eastAsia="Calibri" w:hAnsi="Calibri"/>
         </w:rPr>
-        <w:t xml:space="preserve">2.1. DenseNet-121 (CNN, baseline)</w:t>
+        <w:t>2.1. DenseNet-121 (CNN, baseline)</w:t>
       </w:r>
     </w:p>
     <w:p>
@@ -1006,7 +1006,7 @@
           <w:sz w:val="22"/>
           <w:szCs w:val="22"/>
         </w:rPr>
-        <w:t xml:space="preserve">TRD_Trucha = (0.8088 / 0.9566) × 100 = 84.55 %</w:t>
+        <w:t>TRD_Trucha = (0.8277 / 0.9566) × 100 = 86.53 %</w:t>
       </w:r>
     </w:p>
     <w:p>
@@ -1020,7 +1020,7 @@
           <w:sz w:val="22"/>
           <w:szCs w:val="22"/>
         </w:rPr>
-        <w:t xml:space="preserve">TRD_Rohu = (0.8285 / 0.9566) × 100 = 86.61 %</w:t>
+        <w:t>TRD_Rohu = (0.8416 / 0.9566) × 100 = 87.98 %</w:t>
       </w:r>
     </w:p>
     <w:p>
@@ -1033,7 +1033,7 @@
           <w:sz w:val="22"/>
           <w:szCs w:val="22"/>
         </w:rPr>
-        <w:t xml:space="preserve">Interpretación: conserva el 84.55 % de su desempeño al pasar de Mendeley a Trucha y el 86.61 % al pasar a Rohu.</w:t>
+        <w:t>Interpretación: conserva el 86.53 % de su desempeño al pasar de Mendeley a Trucha y el 87.98 % al pasar a Rohu.</w:t>
       </w:r>
     </w:p>
     <w:p>
@@ -1045,7 +1045,7 @@
         <w:rPr>
           <w:rFonts w:ascii="Calibri" w:cs="Calibri" w:eastAsia="Calibri" w:hAnsi="Calibri"/>
         </w:rPr>
-        <w:t xml:space="preserve">2.2. ViT-Base/16</w:t>
+        <w:t>2.2. ViT-Base/16</w:t>
       </w:r>
     </w:p>
     <w:p>
@@ -1059,7 +1059,7 @@
           <w:sz w:val="22"/>
           <w:szCs w:val="22"/>
         </w:rPr>
-        <w:t xml:space="preserve">TRD_Trucha = (0.8611 / 0.9696) × 100 = 88.81 %</w:t>
+        <w:t>TRD_Trucha = (0.8633 / 0.9696) × 100 = 89.04 %</w:t>
       </w:r>
     </w:p>
     <w:p>
@@ -1073,7 +1073,7 @@
           <w:sz w:val="22"/>
           <w:szCs w:val="22"/>
         </w:rPr>
-        <w:t xml:space="preserve">TRD_Rohu = (0.8817 / 0.9696) × 100 = 90.93 %</w:t>
+        <w:t>TRD_Rohu = (0.9018 / 0.9696) × 100 = 93.01 %</w:t>
       </w:r>
     </w:p>
     <w:p>
@@ -1086,7 +1086,7 @@
           <w:sz w:val="22"/>
           <w:szCs w:val="22"/>
         </w:rPr>
-        <w:t xml:space="preserve">Interpretación: conserva el 88.81 % de su desempeño al pasar de Mendeley a Trucha y el 90.93 % al pasar a Rohu.</w:t>
+        <w:t>Interpretación: conserva el 89.04 % de su desempeño al pasar de Mendeley a Trucha y el 93.01 % al pasar a Rohu.</w:t>
       </w:r>
     </w:p>
     <w:p>
@@ -1098,7 +1098,7 @@
         <w:rPr>
           <w:rFonts w:ascii="Calibri" w:cs="Calibri" w:eastAsia="Calibri" w:hAnsi="Calibri"/>
         </w:rPr>
-        <w:t xml:space="preserve">Tabla completa de retención</w:t>
+        <w:t>Tabla completa de retención</w:t>
       </w:r>
     </w:p>
     <w:tbl>
@@ -1156,7 +1156,7 @@
                 <w:sz w:val="18"/>
                 <w:szCs w:val="18"/>
               </w:rPr>
-              <w:t xml:space="preserve">Modelo</w:t>
+              <w:t>Modelo</w:t>
             </w:r>
           </w:p>
         </w:tc>
@@ -1190,7 +1190,7 @@
                 <w:sz w:val="18"/>
                 <w:szCs w:val="18"/>
               </w:rPr>
-              <w:t xml:space="preserve">F1 Source</w:t>
+              <w:t>F1 Source</w:t>
             </w:r>
           </w:p>
         </w:tc>
@@ -1224,7 +1224,7 @@
                 <w:sz w:val="18"/>
                 <w:szCs w:val="18"/>
               </w:rPr>
-              <w:t xml:space="preserve">F1 Trucha</w:t>
+              <w:t>F1 Trucha</w:t>
             </w:r>
           </w:p>
         </w:tc>
@@ -1258,7 +1258,7 @@
                 <w:sz w:val="18"/>
                 <w:szCs w:val="18"/>
               </w:rPr>
-              <w:t xml:space="preserve">F1 Rohu</w:t>
+              <w:t>F1 Rohu</w:t>
             </w:r>
           </w:p>
         </w:tc>
@@ -1292,7 +1292,7 @@
                 <w:sz w:val="18"/>
                 <w:szCs w:val="18"/>
               </w:rPr>
-              <w:t xml:space="preserve">TRD Trucha (%)</w:t>
+              <w:t>TRD Trucha (%)</w:t>
             </w:r>
           </w:p>
         </w:tc>
@@ -1326,7 +1326,7 @@
                 <w:sz w:val="18"/>
                 <w:szCs w:val="18"/>
               </w:rPr>
-              <w:t xml:space="preserve">TRD Rohu (%)</w:t>
+              <w:t>TRD Rohu (%)</w:t>
             </w:r>
           </w:p>
         </w:tc>
@@ -1360,7 +1360,7 @@
                 <w:sz w:val="18"/>
                 <w:szCs w:val="18"/>
               </w:rPr>
-              <w:t xml:space="preserve">TRD prom. (%)</w:t>
+              <w:t>TRD prom. (%)</w:t>
             </w:r>
           </w:p>
         </w:tc>
@@ -1392,7 +1392,7 @@
                 <w:sz w:val="18"/>
                 <w:szCs w:val="18"/>
               </w:rPr>
-              <w:t xml:space="preserve">DenseNet-121 (CNN, baseline)</w:t>
+              <w:t>DenseNet-121 (CNN, baseline)</w:t>
             </w:r>
           </w:p>
         </w:tc>
@@ -1422,7 +1422,7 @@
                 <w:sz w:val="18"/>
                 <w:szCs w:val="18"/>
               </w:rPr>
-              <w:t xml:space="preserve">0.9566</w:t>
+              <w:t>0.9566</w:t>
             </w:r>
           </w:p>
         </w:tc>
@@ -1452,7 +1452,7 @@
                 <w:sz w:val="18"/>
                 <w:szCs w:val="18"/>
               </w:rPr>
-              <w:t xml:space="preserve">0.8088</w:t>
+              <w:t>0.8277</w:t>
             </w:r>
           </w:p>
         </w:tc>
@@ -1482,7 +1482,7 @@
                 <w:sz w:val="18"/>
                 <w:szCs w:val="18"/>
               </w:rPr>
-              <w:t xml:space="preserve">0.8285</w:t>
+              <w:t>0.8416</w:t>
             </w:r>
           </w:p>
         </w:tc>
@@ -1512,7 +1512,7 @@
                 <w:sz w:val="18"/>
                 <w:szCs w:val="18"/>
               </w:rPr>
-              <w:t xml:space="preserve">84.55</w:t>
+              <w:t>86.53</w:t>
             </w:r>
           </w:p>
         </w:tc>
@@ -1542,7 +1542,7 @@
                 <w:sz w:val="18"/>
                 <w:szCs w:val="18"/>
               </w:rPr>
-              <w:t xml:space="preserve">86.61</w:t>
+              <w:t>87.98</w:t>
             </w:r>
           </w:p>
         </w:tc>
@@ -1572,7 +1572,7 @@
                 <w:sz w:val="18"/>
                 <w:szCs w:val="18"/>
               </w:rPr>
-              <w:t xml:space="preserve">85.58</w:t>
+              <w:t>87.26</w:t>
             </w:r>
           </w:p>
         </w:tc>
@@ -1604,7 +1604,7 @@
                 <w:sz w:val="18"/>
                 <w:szCs w:val="18"/>
               </w:rPr>
-              <w:t xml:space="preserve">ViT-Base/16</w:t>
+              <w:t>ViT-Base/16</w:t>
             </w:r>
           </w:p>
         </w:tc>
@@ -1634,7 +1634,7 @@
                 <w:sz w:val="18"/>
                 <w:szCs w:val="18"/>
               </w:rPr>
-              <w:t xml:space="preserve">0.9696</w:t>
+              <w:t>0.9696</w:t>
             </w:r>
           </w:p>
         </w:tc>
@@ -1664,7 +1664,7 @@
                 <w:sz w:val="18"/>
                 <w:szCs w:val="18"/>
               </w:rPr>
-              <w:t xml:space="preserve">0.8611</w:t>
+              <w:t>0.8633</w:t>
             </w:r>
           </w:p>
         </w:tc>
@@ -1694,7 +1694,7 @@
                 <w:sz w:val="18"/>
                 <w:szCs w:val="18"/>
               </w:rPr>
-              <w:t xml:space="preserve">0.8817</w:t>
+              <w:t>0.9018</w:t>
             </w:r>
           </w:p>
         </w:tc>
@@ -1724,7 +1724,7 @@
                 <w:sz w:val="18"/>
                 <w:szCs w:val="18"/>
               </w:rPr>
-              <w:t xml:space="preserve">88.81</w:t>
+              <w:t>89.04</w:t>
             </w:r>
           </w:p>
         </w:tc>
@@ -1754,7 +1754,7 @@
                 <w:sz w:val="18"/>
                 <w:szCs w:val="18"/>
               </w:rPr>
-              <w:t xml:space="preserve">90.93</w:t>
+              <w:t>93.01</w:t>
             </w:r>
           </w:p>
         </w:tc>
@@ -1784,7 +1784,7 @@
                 <w:sz w:val="18"/>
                 <w:szCs w:val="18"/>
               </w:rPr>
-              <w:t xml:space="preserve">89.87</w:t>
+              <w:t>91.03</w:t>
             </w:r>
           </w:p>
         </w:tc>
@@ -1800,7 +1800,7 @@
           <w:sz w:val="22"/>
           <w:szCs w:val="22"/>
         </w:rPr>
-        <w:t xml:space="preserve">TRD promedio = (TRD_Trucha + TRD_Rohu) / 2. Por ejemplo, para ViT-Base/16:</w:t>
+        <w:t>TRD promedio = (TRD_Trucha + TRD_Rohu) / 2. Por ejemplo, para ViT-Base/16:</w:t>
       </w:r>
     </w:p>
     <w:p>
@@ -1814,7 +1814,7 @@
           <w:sz w:val="22"/>
           <w:szCs w:val="22"/>
         </w:rPr>
-        <w:t xml:space="preserve">TRD_prom = (88.81 + 90.93) / 2 = 89.87 %</w:t>
+        <w:t>TRD_prom = (89.04 + 93.01) / 2 = 91.03 %</w:t>
       </w:r>
     </w:p>
     <w:p>
@@ -1826,7 +1826,7 @@
         <w:rPr>
           <w:rFonts w:ascii="Calibri" w:cs="Calibri" w:eastAsia="Calibri" w:hAnsi="Calibri"/>
         </w:rPr>
-        <w:t xml:space="preserve">3. Brecha de error entre conjuntos de datos (Gap)</w:t>
+        <w:t>3. Brecha de error entre conjuntos de datos (Gap)</w:t>
       </w:r>
     </w:p>
     <w:p>
@@ -1839,7 +1839,7 @@
           <w:sz w:val="22"/>
           <w:szCs w:val="22"/>
         </w:rPr>
-        <w:t xml:space="preserve">Primero se obtiene el error asociado al F1 macro y luego la brecha entre el error del dominio objetivo y el del dominio fuente:</w:t>
+        <w:t>Primero se obtiene el error asociado al F1 macro y luego la brecha entre el error del dominio objetivo y el del dominio fuente:</w:t>
       </w:r>
     </w:p>
     <w:p>
@@ -1853,7 +1853,7 @@
           <w:sz w:val="22"/>
           <w:szCs w:val="22"/>
         </w:rPr>
-        <w:t xml:space="preserve">Error = 1 − F1</w:t>
+        <w:t>Error = 1 − F1</w:t>
       </w:r>
     </w:p>
     <w:p>
@@ -1867,7 +1867,7 @@
           <w:sz w:val="22"/>
           <w:szCs w:val="22"/>
         </w:rPr>
-        <w:t xml:space="preserve">Gapⱼ = Error_Targetⱼ − Error_Source = F1_Source − F1_Targetⱼ</w:t>
+        <w:t>Gapⱼ = Error_Targetⱼ − Error_Source = F1_Source − F1_Targetⱼ</w:t>
       </w:r>
     </w:p>
     <w:p>
@@ -1880,7 +1880,7 @@
           <w:sz w:val="22"/>
           <w:szCs w:val="22"/>
         </w:rPr>
-        <w:t xml:space="preserve">Cuanto menor sea el Gap, menor es la degradación producida por el cambio de dominio.</w:t>
+        <w:t>Cuanto menor sea el Gap, menor es la degradación producida por el cambio de dominio.</w:t>
       </w:r>
     </w:p>
     <w:p>
@@ -1892,7 +1892,7 @@
         <w:rPr>
           <w:rFonts w:ascii="Calibri" w:cs="Calibri" w:eastAsia="Calibri" w:hAnsi="Calibri"/>
         </w:rPr>
-        <w:t xml:space="preserve">3.1. DenseNet-121 (CNN, baseline)</w:t>
+        <w:t>3.1. DenseNet-121 (CNN, baseline)</w:t>
       </w:r>
     </w:p>
     <w:p>
@@ -1906,7 +1906,7 @@
           <w:sz w:val="22"/>
           <w:szCs w:val="22"/>
         </w:rPr>
-        <w:t xml:space="preserve">Error_Source = 1 − 0.9566 = 0.0434</w:t>
+        <w:t>Error_Source = 1 − 0.9566 = 0.0434</w:t>
       </w:r>
     </w:p>
     <w:p>
@@ -1920,7 +1920,7 @@
           <w:sz w:val="22"/>
           <w:szCs w:val="22"/>
         </w:rPr>
-        <w:t xml:space="preserve">Error_Trucha = 1 − 0.8088 = 0.1912   →   Gap_Trucha = 0.1912 − 0.0434 = 0.1478</w:t>
+        <w:t>Error_Trucha = 1 − 0.8277 = 0.1723   →   Gap_Trucha = 0.1723 − 0.0434 = 0.1289</w:t>
       </w:r>
     </w:p>
     <w:p>
@@ -1934,7 +1934,7 @@
           <w:sz w:val="22"/>
           <w:szCs w:val="22"/>
         </w:rPr>
-        <w:t xml:space="preserve">Error_Rohu = 1 − 0.8285 = 0.1715   →   Gap_Rohu = 0.1715 − 0.0434 = 0.1281</w:t>
+        <w:t>Error_Rohu = 1 − 0.8416 = 0.1584   →   Gap_Rohu = 0.1584 − 0.0434 = 0.1150</w:t>
       </w:r>
     </w:p>
     <w:p>
@@ -1946,7 +1946,7 @@
         <w:rPr>
           <w:rFonts w:ascii="Calibri" w:cs="Calibri" w:eastAsia="Calibri" w:hAnsi="Calibri"/>
         </w:rPr>
-        <w:t xml:space="preserve">3.2. ViT-Base/16</w:t>
+        <w:t>3.2. ViT-Base/16</w:t>
       </w:r>
     </w:p>
     <w:p>
@@ -1960,7 +1960,7 @@
           <w:sz w:val="22"/>
           <w:szCs w:val="22"/>
         </w:rPr>
-        <w:t xml:space="preserve">Error_Source = 1 − 0.9696 = 0.0304</w:t>
+        <w:t>Error_Source = 1 − 0.9696 = 0.0304</w:t>
       </w:r>
     </w:p>
     <w:p>
@@ -1974,7 +1974,7 @@
           <w:sz w:val="22"/>
           <w:szCs w:val="22"/>
         </w:rPr>
-        <w:t xml:space="preserve">Error_Trucha = 1 − 0.8611 = 0.1389   →   Gap_Trucha = 0.1389 − 0.0304 = 0.1085</w:t>
+        <w:t>Error_Trucha = 1 − 0.8633 = 0.1367   →   Gap_Trucha = 0.1367 − 0.0304 = 0.1063</w:t>
       </w:r>
     </w:p>
     <w:p>
@@ -1988,7 +1988,7 @@
           <w:sz w:val="22"/>
           <w:szCs w:val="22"/>
         </w:rPr>
-        <w:t xml:space="preserve">Error_Rohu = 1 − 0.8817 = 0.1183   →   Gap_Rohu = 0.1183 − 0.0304 = 0.0879</w:t>
+        <w:t>Error_Rohu = 1 − 0.9018 = 0.0982   →   Gap_Rohu = 0.0982 − 0.0304 = 0.0678</w:t>
       </w:r>
     </w:p>
     <w:p>
@@ -2000,7 +2000,7 @@
         <w:rPr>
           <w:rFonts w:ascii="Calibri" w:cs="Calibri" w:eastAsia="Calibri" w:hAnsi="Calibri"/>
         </w:rPr>
-        <w:t xml:space="preserve">Tabla completa de errores y brechas</w:t>
+        <w:t>Tabla completa de errores y brechas</w:t>
       </w:r>
     </w:p>
     <w:tbl>
@@ -2058,7 +2058,7 @@
                 <w:sz w:val="18"/>
                 <w:szCs w:val="18"/>
               </w:rPr>
-              <w:t xml:space="preserve">Modelo</w:t>
+              <w:t>Modelo</w:t>
             </w:r>
           </w:p>
         </w:tc>
@@ -2092,7 +2092,7 @@
                 <w:sz w:val="18"/>
                 <w:szCs w:val="18"/>
               </w:rPr>
-              <w:t xml:space="preserve">Error Source</w:t>
+              <w:t>Error Source</w:t>
             </w:r>
           </w:p>
         </w:tc>
@@ -2126,7 +2126,7 @@
                 <w:sz w:val="18"/>
                 <w:szCs w:val="18"/>
               </w:rPr>
-              <w:t xml:space="preserve">Error Trucha</w:t>
+              <w:t>Error Trucha</w:t>
             </w:r>
           </w:p>
         </w:tc>
@@ -2160,7 +2160,7 @@
                 <w:sz w:val="18"/>
                 <w:szCs w:val="18"/>
               </w:rPr>
-              <w:t xml:space="preserve">Error Rohu</w:t>
+              <w:t>Error Rohu</w:t>
             </w:r>
           </w:p>
         </w:tc>
@@ -2194,7 +2194,7 @@
                 <w:sz w:val="18"/>
                 <w:szCs w:val="18"/>
               </w:rPr>
-              <w:t xml:space="preserve">Gap Trucha</w:t>
+              <w:t>Gap Trucha</w:t>
             </w:r>
           </w:p>
         </w:tc>
@@ -2228,7 +2228,7 @@
                 <w:sz w:val="18"/>
                 <w:szCs w:val="18"/>
               </w:rPr>
-              <w:t xml:space="preserve">Gap Rohu</w:t>
+              <w:t>Gap Rohu</w:t>
             </w:r>
           </w:p>
         </w:tc>
@@ -2262,7 +2262,7 @@
                 <w:sz w:val="18"/>
                 <w:szCs w:val="18"/>
               </w:rPr>
-              <w:t xml:space="preserve">Gap prom.</w:t>
+              <w:t>Gap prom.</w:t>
             </w:r>
           </w:p>
         </w:tc>
@@ -2294,7 +2294,7 @@
                 <w:sz w:val="18"/>
                 <w:szCs w:val="18"/>
               </w:rPr>
-              <w:t xml:space="preserve">DenseNet-121 (CNN, baseline)</w:t>
+              <w:t>DenseNet-121 (CNN, baseline)</w:t>
             </w:r>
           </w:p>
         </w:tc>
@@ -2324,7 +2324,7 @@
                 <w:sz w:val="18"/>
                 <w:szCs w:val="18"/>
               </w:rPr>
-              <w:t xml:space="preserve">0.0434</w:t>
+              <w:t>0.0434</w:t>
             </w:r>
           </w:p>
         </w:tc>
@@ -2354,7 +2354,7 @@
                 <w:sz w:val="18"/>
                 <w:szCs w:val="18"/>
               </w:rPr>
-              <w:t xml:space="preserve">0.1912</w:t>
+              <w:t>0.1723</w:t>
             </w:r>
           </w:p>
         </w:tc>
@@ -2384,7 +2384,7 @@
                 <w:sz w:val="18"/>
                 <w:szCs w:val="18"/>
               </w:rPr>
-              <w:t xml:space="preserve">0.1715</w:t>
+              <w:t>0.1584</w:t>
             </w:r>
           </w:p>
         </w:tc>
@@ -2414,7 +2414,7 @@
                 <w:sz w:val="18"/>
                 <w:szCs w:val="18"/>
               </w:rPr>
-              <w:t xml:space="preserve">0.1478</w:t>
+              <w:t>0.1289</w:t>
             </w:r>
           </w:p>
         </w:tc>
@@ -2444,7 +2444,7 @@
                 <w:sz w:val="18"/>
                 <w:szCs w:val="18"/>
               </w:rPr>
-              <w:t xml:space="preserve">0.1281</w:t>
+              <w:t>0.1150</w:t>
             </w:r>
           </w:p>
         </w:tc>
@@ -2474,7 +2474,7 @@
                 <w:sz w:val="18"/>
                 <w:szCs w:val="18"/>
               </w:rPr>
-              <w:t xml:space="preserve">0.1380</w:t>
+              <w:t>0.1220</w:t>
             </w:r>
           </w:p>
         </w:tc>
@@ -2506,7 +2506,7 @@
                 <w:sz w:val="18"/>
                 <w:szCs w:val="18"/>
               </w:rPr>
-              <w:t xml:space="preserve">ViT-Base/16</w:t>
+              <w:t>ViT-Base/16</w:t>
             </w:r>
           </w:p>
         </w:tc>
@@ -2536,7 +2536,7 @@
                 <w:sz w:val="18"/>
                 <w:szCs w:val="18"/>
               </w:rPr>
-              <w:t xml:space="preserve">0.0304</w:t>
+              <w:t>0.0304</w:t>
             </w:r>
           </w:p>
         </w:tc>
@@ -2566,7 +2566,7 @@
                 <w:sz w:val="18"/>
                 <w:szCs w:val="18"/>
               </w:rPr>
-              <w:t xml:space="preserve">0.1389</w:t>
+              <w:t>0.1367</w:t>
             </w:r>
           </w:p>
         </w:tc>
@@ -2596,7 +2596,7 @@
                 <w:sz w:val="18"/>
                 <w:szCs w:val="18"/>
               </w:rPr>
-              <w:t xml:space="preserve">0.1183</w:t>
+              <w:t>0.0982</w:t>
             </w:r>
           </w:p>
         </w:tc>
@@ -2626,7 +2626,7 @@
                 <w:sz w:val="18"/>
                 <w:szCs w:val="18"/>
               </w:rPr>
-              <w:t xml:space="preserve">0.1085</w:t>
+              <w:t>0.1063</w:t>
             </w:r>
           </w:p>
         </w:tc>
@@ -2656,7 +2656,7 @@
                 <w:sz w:val="18"/>
                 <w:szCs w:val="18"/>
               </w:rPr>
-              <w:t xml:space="preserve">0.0879</w:t>
+              <w:t>0.0678</w:t>
             </w:r>
           </w:p>
         </w:tc>
@@ -2686,7 +2686,7 @@
                 <w:sz w:val="18"/>
                 <w:szCs w:val="18"/>
               </w:rPr>
-              <w:t xml:space="preserve">0.0982</w:t>
+              <w:t>0.0871</w:t>
             </w:r>
           </w:p>
         </w:tc>
@@ -2701,7 +2701,7 @@
         <w:rPr>
           <w:rFonts w:ascii="Calibri" w:cs="Calibri" w:eastAsia="Calibri" w:hAnsi="Calibri"/>
         </w:rPr>
-        <w:t xml:space="preserve">4. Reducción de la Brecha de Error (RBE)</w:t>
+        <w:t>4. Reducción de la Brecha de Error (RBE)</w:t>
       </w:r>
     </w:p>
     <w:p>
@@ -2714,7 +2714,7 @@
           <w:sz w:val="22"/>
           <w:szCs w:val="22"/>
         </w:rPr>
-        <w:t xml:space="preserve">Mide cuánto reduce cada modelo la brecha de error respecto al baseline. Se usa como baseline la CNN DenseNet-121 (la mejor CNN del proyecto), con brechas de 0.1478 en Trucha y 0.1281 en Rohu.</w:t>
+        <w:t>Mide cuánto reduce cada modelo la brecha de error respecto al baseline. Se usa como baseline la CNN DenseNet-121 (la mejor CNN del proyecto), con brechas de 0.1289 en Trucha y 0.1150 en Rohu.</w:t>
       </w:r>
     </w:p>
     <w:p>
@@ -2728,7 +2728,7 @@
           <w:sz w:val="22"/>
           <w:szCs w:val="22"/>
         </w:rPr>
-        <w:t xml:space="preserve">RBEⱼ = (Gap_baseline,ⱼ − Gap_modelo,ⱼ) / Gap_baseline,ⱼ × 100</w:t>
+        <w:t>RBEⱼ = (Gap_baseline,ⱼ − Gap_modelo,ⱼ) / Gap_baseline,ⱼ × 100</w:t>
       </w:r>
     </w:p>
     <w:p>
@@ -2740,7 +2740,7 @@
         <w:rPr>
           <w:rFonts w:ascii="Calibri" w:cs="Calibri" w:eastAsia="Calibri" w:hAnsi="Calibri"/>
         </w:rPr>
-        <w:t xml:space="preserve">4.1. ViT-Base/16 frente a DenseNet-121</w:t>
+        <w:t>4.1. ViT-Base/16 frente a DenseNet-121</w:t>
       </w:r>
     </w:p>
     <w:p>
@@ -2754,7 +2754,7 @@
           <w:sz w:val="22"/>
           <w:szCs w:val="22"/>
         </w:rPr>
-        <w:t xml:space="preserve">RBE_Trucha = (0.1478 − 0.1085) / 0.1478 × 100 = 26.59 %</w:t>
+        <w:t>RBE_Trucha = (0.1289 − 0.1063) / 0.1289 × 100 = 17.53 %</w:t>
       </w:r>
     </w:p>
     <w:p>
@@ -2768,7 +2768,7 @@
           <w:sz w:val="22"/>
           <w:szCs w:val="22"/>
         </w:rPr>
-        <w:t xml:space="preserve">RBE_Rohu = (0.1281 − 0.0879) / 0.1281 × 100 = 31.38 %</w:t>
+        <w:t>RBE_Rohu = (0.1150 − 0.0678) / 0.1150 × 100 = 41.04 %</w:t>
       </w:r>
     </w:p>
     <w:p>
@@ -2780,7 +2780,7 @@
         <w:rPr>
           <w:rFonts w:ascii="Calibri" w:cs="Calibri" w:eastAsia="Calibri" w:hAnsi="Calibri"/>
         </w:rPr>
-        <w:t xml:space="preserve">Tabla completa de reducción de brecha</w:t>
+        <w:t>Tabla completa de reducción de brecha</w:t>
       </w:r>
     </w:p>
     <w:tbl>
@@ -2837,7 +2837,7 @@
                 <w:sz w:val="18"/>
                 <w:szCs w:val="18"/>
               </w:rPr>
-              <w:t xml:space="preserve">Modelo</w:t>
+              <w:t>Modelo</w:t>
             </w:r>
           </w:p>
         </w:tc>
@@ -2871,7 +2871,7 @@
                 <w:sz w:val="18"/>
                 <w:szCs w:val="18"/>
               </w:rPr>
-              <w:t xml:space="preserve">Gap Trucha</w:t>
+              <w:t>Gap Trucha</w:t>
             </w:r>
           </w:p>
         </w:tc>
@@ -2905,7 +2905,7 @@
                 <w:sz w:val="18"/>
                 <w:szCs w:val="18"/>
               </w:rPr>
-              <w:t xml:space="preserve">Gap Rohu</w:t>
+              <w:t>Gap Rohu</w:t>
             </w:r>
           </w:p>
         </w:tc>
@@ -2939,7 +2939,7 @@
                 <w:sz w:val="18"/>
                 <w:szCs w:val="18"/>
               </w:rPr>
-              <w:t xml:space="preserve">RBE Trucha (%)</w:t>
+              <w:t>RBE Trucha (%)</w:t>
             </w:r>
           </w:p>
         </w:tc>
@@ -2973,7 +2973,7 @@
                 <w:sz w:val="18"/>
                 <w:szCs w:val="18"/>
               </w:rPr>
-              <w:t xml:space="preserve">RBE Rohu (%)</w:t>
+              <w:t>RBE Rohu (%)</w:t>
             </w:r>
           </w:p>
         </w:tc>
@@ -3007,7 +3007,7 @@
                 <w:sz w:val="18"/>
                 <w:szCs w:val="18"/>
               </w:rPr>
-              <w:t xml:space="preserve">RBE prom. (%)</w:t>
+              <w:t>RBE prom. (%)</w:t>
             </w:r>
           </w:p>
         </w:tc>
@@ -3039,7 +3039,7 @@
                 <w:sz w:val="18"/>
                 <w:szCs w:val="18"/>
               </w:rPr>
-              <w:t xml:space="preserve">DenseNet-121 (CNN, baseline)</w:t>
+              <w:t>DenseNet-121 (CNN, baseline)</w:t>
             </w:r>
           </w:p>
         </w:tc>
@@ -3069,7 +3069,7 @@
                 <w:sz w:val="18"/>
                 <w:szCs w:val="18"/>
               </w:rPr>
-              <w:t xml:space="preserve">0.1478</w:t>
+              <w:t>0.1289</w:t>
             </w:r>
           </w:p>
         </w:tc>
@@ -3099,7 +3099,7 @@
                 <w:sz w:val="18"/>
                 <w:szCs w:val="18"/>
               </w:rPr>
-              <w:t xml:space="preserve">0.1281</w:t>
+              <w:t>0.1150</w:t>
             </w:r>
           </w:p>
         </w:tc>
@@ -3129,7 +3129,7 @@
                 <w:sz w:val="18"/>
                 <w:szCs w:val="18"/>
               </w:rPr>
-              <w:t xml:space="preserve">—</w:t>
+              <w:t>—</w:t>
             </w:r>
           </w:p>
         </w:tc>
@@ -3159,7 +3159,7 @@
                 <w:sz w:val="18"/>
                 <w:szCs w:val="18"/>
               </w:rPr>
-              <w:t xml:space="preserve">—</w:t>
+              <w:t>—</w:t>
             </w:r>
           </w:p>
         </w:tc>
@@ -3189,7 +3189,7 @@
                 <w:sz w:val="18"/>
                 <w:szCs w:val="18"/>
               </w:rPr>
-              <w:t xml:space="preserve">—</w:t>
+              <w:t>—</w:t>
             </w:r>
           </w:p>
         </w:tc>
@@ -3221,7 +3221,7 @@
                 <w:sz w:val="18"/>
                 <w:szCs w:val="18"/>
               </w:rPr>
-              <w:t xml:space="preserve">ViT-Base/16</w:t>
+              <w:t>ViT-Base/16</w:t>
             </w:r>
           </w:p>
         </w:tc>
@@ -3251,7 +3251,7 @@
                 <w:sz w:val="18"/>
                 <w:szCs w:val="18"/>
               </w:rPr>
-              <w:t xml:space="preserve">0.1085</w:t>
+              <w:t>0.1063</w:t>
             </w:r>
           </w:p>
         </w:tc>
@@ -3281,7 +3281,7 @@
                 <w:sz w:val="18"/>
                 <w:szCs w:val="18"/>
               </w:rPr>
-              <w:t xml:space="preserve">0.0879</w:t>
+              <w:t>0.0678</w:t>
             </w:r>
           </w:p>
         </w:tc>
@@ -3311,7 +3311,7 @@
                 <w:sz w:val="18"/>
                 <w:szCs w:val="18"/>
               </w:rPr>
-              <w:t xml:space="preserve">26.59</w:t>
+              <w:t>17.53</w:t>
             </w:r>
           </w:p>
         </w:tc>
@@ -3341,7 +3341,7 @@
                 <w:sz w:val="18"/>
                 <w:szCs w:val="18"/>
               </w:rPr>
-              <w:t xml:space="preserve">31.38</w:t>
+              <w:t>41.04</w:t>
             </w:r>
           </w:p>
         </w:tc>
@@ -3371,7 +3371,7 @@
                 <w:sz w:val="18"/>
                 <w:szCs w:val="18"/>
               </w:rPr>
-              <w:t xml:space="preserve">28.99</w:t>
+              <w:t>29.29</w:t>
             </w:r>
           </w:p>
         </w:tc>
@@ -3386,7 +3386,7 @@
         <w:rPr>
           <w:rFonts w:ascii="Calibri" w:cs="Calibri" w:eastAsia="Calibri" w:hAnsi="Calibri"/>
         </w:rPr>
-        <w:t xml:space="preserve">5. Tabla consolidada final</w:t>
+        <w:t>5. Tabla consolidada final</w:t>
       </w:r>
     </w:p>
     <w:tbl>
@@ -3447,7 +3447,7 @@
                 <w:sz w:val="18"/>
                 <w:szCs w:val="18"/>
               </w:rPr>
-              <w:t xml:space="preserve">Modelo</w:t>
+              <w:t>Modelo</w:t>
             </w:r>
           </w:p>
         </w:tc>
@@ -3481,7 +3481,7 @@
                 <w:sz w:val="18"/>
                 <w:szCs w:val="18"/>
               </w:rPr>
-              <w:t xml:space="preserve">F1 Src</w:t>
+              <w:t>F1 Src</w:t>
             </w:r>
           </w:p>
         </w:tc>
@@ -3515,7 +3515,7 @@
                 <w:sz w:val="18"/>
                 <w:szCs w:val="18"/>
               </w:rPr>
-              <w:t xml:space="preserve">F1 Trucha</w:t>
+              <w:t>F1 Trucha</w:t>
             </w:r>
           </w:p>
         </w:tc>
@@ -3549,7 +3549,7 @@
                 <w:sz w:val="18"/>
                 <w:szCs w:val="18"/>
               </w:rPr>
-              <w:t xml:space="preserve">F1 Rohu</w:t>
+              <w:t>F1 Rohu</w:t>
             </w:r>
           </w:p>
         </w:tc>
@@ -3583,7 +3583,7 @@
                 <w:sz w:val="18"/>
                 <w:szCs w:val="18"/>
               </w:rPr>
-              <w:t xml:space="preserve">TRD Trucha %</w:t>
+              <w:t>TRD Trucha %</w:t>
             </w:r>
           </w:p>
         </w:tc>
@@ -3617,7 +3617,7 @@
                 <w:sz w:val="18"/>
                 <w:szCs w:val="18"/>
               </w:rPr>
-              <w:t xml:space="preserve">TRD Rohu %</w:t>
+              <w:t>TRD Rohu %</w:t>
             </w:r>
           </w:p>
         </w:tc>
@@ -3651,7 +3651,7 @@
                 <w:sz w:val="18"/>
                 <w:szCs w:val="18"/>
               </w:rPr>
-              <w:t xml:space="preserve">Gap Trucha</w:t>
+              <w:t>Gap Trucha</w:t>
             </w:r>
           </w:p>
         </w:tc>
@@ -3685,7 +3685,7 @@
                 <w:sz w:val="18"/>
                 <w:szCs w:val="18"/>
               </w:rPr>
-              <w:t xml:space="preserve">Gap Rohu</w:t>
+              <w:t>Gap Rohu</w:t>
             </w:r>
           </w:p>
         </w:tc>
@@ -3719,7 +3719,7 @@
                 <w:sz w:val="18"/>
                 <w:szCs w:val="18"/>
               </w:rPr>
-              <w:t xml:space="preserve">RBE Trucha %</w:t>
+              <w:t>RBE Trucha %</w:t>
             </w:r>
           </w:p>
         </w:tc>
@@ -3753,7 +3753,7 @@
                 <w:sz w:val="18"/>
                 <w:szCs w:val="18"/>
               </w:rPr>
-              <w:t xml:space="preserve">RBE Rohu %</w:t>
+              <w:t>RBE Rohu %</w:t>
             </w:r>
           </w:p>
         </w:tc>
@@ -3787,7 +3787,7 @@
                 <w:sz w:val="18"/>
                 <w:szCs w:val="18"/>
               </w:rPr>
-              <w:t xml:space="preserve">DenseNet-121 (CNN, baseline)</w:t>
+              <w:t>DenseNet-121 (CNN, baseline)</w:t>
             </w:r>
           </w:p>
         </w:tc>
@@ -3819,7 +3819,7 @@
                 <w:sz w:val="18"/>
                 <w:szCs w:val="18"/>
               </w:rPr>
-              <w:t xml:space="preserve">0.9566</w:t>
+              <w:t>0.9566</w:t>
             </w:r>
           </w:p>
         </w:tc>
@@ -3851,7 +3851,7 @@
                 <w:sz w:val="18"/>
                 <w:szCs w:val="18"/>
               </w:rPr>
-              <w:t xml:space="preserve">0.8088</w:t>
+              <w:t>0.8277</w:t>
             </w:r>
           </w:p>
         </w:tc>
@@ -3883,7 +3883,7 @@
                 <w:sz w:val="18"/>
                 <w:szCs w:val="18"/>
               </w:rPr>
-              <w:t xml:space="preserve">0.8285</w:t>
+              <w:t>0.8416</w:t>
             </w:r>
           </w:p>
         </w:tc>
@@ -3915,7 +3915,7 @@
                 <w:sz w:val="18"/>
                 <w:szCs w:val="18"/>
               </w:rPr>
-              <w:t xml:space="preserve">84.55</w:t>
+              <w:t>86.53</w:t>
             </w:r>
           </w:p>
         </w:tc>
@@ -3947,7 +3947,7 @@
                 <w:sz w:val="18"/>
                 <w:szCs w:val="18"/>
               </w:rPr>
-              <w:t xml:space="preserve">86.61</w:t>
+              <w:t>87.98</w:t>
             </w:r>
           </w:p>
         </w:tc>
@@ -3979,7 +3979,7 @@
                 <w:sz w:val="18"/>
                 <w:szCs w:val="18"/>
               </w:rPr>
-              <w:t xml:space="preserve">0.1478</w:t>
+              <w:t>0.1289</w:t>
             </w:r>
           </w:p>
         </w:tc>
@@ -4011,7 +4011,7 @@
                 <w:sz w:val="18"/>
                 <w:szCs w:val="18"/>
               </w:rPr>
-              <w:t xml:space="preserve">0.1281</w:t>
+              <w:t>0.1150</w:t>
             </w:r>
           </w:p>
         </w:tc>
@@ -4043,7 +4043,7 @@
                 <w:sz w:val="18"/>
                 <w:szCs w:val="18"/>
               </w:rPr>
-              <w:t xml:space="preserve">—</w:t>
+              <w:t>—</w:t>
             </w:r>
           </w:p>
         </w:tc>
@@ -4075,7 +4075,7 @@
                 <w:sz w:val="18"/>
                 <w:szCs w:val="18"/>
               </w:rPr>
-              <w:t xml:space="preserve">—</w:t>
+              <w:t>—</w:t>
             </w:r>
           </w:p>
         </w:tc>
@@ -4109,7 +4109,7 @@
                 <w:sz w:val="18"/>
                 <w:szCs w:val="18"/>
               </w:rPr>
-              <w:t xml:space="preserve">ViT-Base/16</w:t>
+              <w:t>ViT-Base/16</w:t>
             </w:r>
           </w:p>
         </w:tc>
@@ -4141,7 +4141,7 @@
                 <w:sz w:val="18"/>
                 <w:szCs w:val="18"/>
               </w:rPr>
-              <w:t xml:space="preserve">0.9696</w:t>
+              <w:t>0.9696</w:t>
             </w:r>
           </w:p>
         </w:tc>
@@ -4173,7 +4173,7 @@
                 <w:sz w:val="18"/>
                 <w:szCs w:val="18"/>
               </w:rPr>
-              <w:t xml:space="preserve">0.8611</w:t>
+              <w:t>0.8633</w:t>
             </w:r>
           </w:p>
         </w:tc>
@@ -4205,7 +4205,7 @@
                 <w:sz w:val="18"/>
                 <w:szCs w:val="18"/>
               </w:rPr>
-              <w:t xml:space="preserve">0.8817</w:t>
+              <w:t>0.9018</w:t>
             </w:r>
           </w:p>
         </w:tc>
@@ -4237,7 +4237,7 @@
                 <w:sz w:val="18"/>
                 <w:szCs w:val="18"/>
               </w:rPr>
-              <w:t xml:space="preserve">88.81</w:t>
+              <w:t>89.04</w:t>
             </w:r>
           </w:p>
         </w:tc>
@@ -4269,7 +4269,7 @@
                 <w:sz w:val="18"/>
                 <w:szCs w:val="18"/>
               </w:rPr>
-              <w:t xml:space="preserve">90.93</w:t>
+              <w:t>93.01</w:t>
             </w:r>
           </w:p>
         </w:tc>
@@ -4301,7 +4301,7 @@
                 <w:sz w:val="18"/>
                 <w:szCs w:val="18"/>
               </w:rPr>
-              <w:t xml:space="preserve">0.1085</w:t>
+              <w:t>0.1063</w:t>
             </w:r>
           </w:p>
         </w:tc>
@@ -4333,7 +4333,7 @@
                 <w:sz w:val="18"/>
                 <w:szCs w:val="18"/>
               </w:rPr>
-              <w:t xml:space="preserve">0.0879</w:t>
+              <w:t>0.0678</w:t>
             </w:r>
           </w:p>
         </w:tc>
@@ -4365,7 +4365,7 @@
                 <w:sz w:val="18"/>
                 <w:szCs w:val="18"/>
               </w:rPr>
-              <w:t xml:space="preserve">26.59</w:t>
+              <w:t>17.53</w:t>
             </w:r>
           </w:p>
         </w:tc>
@@ -4397,7 +4397,7 @@
                 <w:sz w:val="18"/>
                 <w:szCs w:val="18"/>
               </w:rPr>
-              <w:t xml:space="preserve">31.38</w:t>
+              <w:t>41.04</w:t>
             </w:r>
           </w:p>
         </w:tc>
@@ -4412,7 +4412,7 @@
         <w:rPr>
           <w:rFonts w:ascii="Calibri" w:cs="Calibri" w:eastAsia="Calibri" w:hAnsi="Calibri"/>
         </w:rPr>
-        <w:t xml:space="preserve">6. Interpretación</w:t>
+        <w:t>6. Interpretación</w:t>
       </w:r>
     </w:p>
     <w:p>
@@ -4435,7 +4435,7 @@
           <w:sz w:val="22"/>
           <w:szCs w:val="22"/>
         </w:rPr>
-        <w:t xml:space="preserve">El ViT conserva el 88.81 % de su desempeño en Trucha y el 90.93 % en Rohu (promedio 89.87 %), frente a 84.55 % y 86.61 % de la CNN (promedio 85.58 %).</w:t>
+        <w:t>El ViT conserva el 89.04 % de su desempeño en Trucha y el 93.01 % en Rohu (promedio 91.03 %), frente a 86.53 % y 87.98 % de la CNN (promedio 87.26 %).</w:t>
       </w:r>
     </w:p>
     <w:p>
@@ -4458,7 +4458,7 @@
           <w:sz w:val="22"/>
           <w:szCs w:val="22"/>
         </w:rPr>
-        <w:t xml:space="preserve">Gap promedio de 0.0982 frente a 0.1380 de DenseNet-121, lo que equivale a una reducción de la brecha de 26.59 % en Trucha y 31.38 % en Rohu (promedio 28.99 %).</w:t>
+        <w:t>Gap promedio de 0.0871 frente a 0.1220 de DenseNet-121, lo que equivale a una reducción de la brecha de 17.53 % en Trucha y 41.04 % en Rohu (promedio 29.29 %).</w:t>
       </w:r>
     </w:p>
     <w:p>
@@ -4481,7 +4481,7 @@
           <w:sz w:val="22"/>
           <w:szCs w:val="22"/>
         </w:rPr>
-        <w:t xml:space="preserve">(0.9696 vs. 0.9566), por lo que su ventaja no se explica por perder menos desde un punto de partida más bajo: es mejor en el dominio fuente y degrada menos al cambiar de dominio.</w:t>
+        <w:t>(0.9696 vs. 0.9566), por lo que su ventaja no se explica por perder menos desde un punto de partida más bajo: es mejor en el dominio fuente y degrada menos al cambiar de dominio.</w:t>
       </w:r>
     </w:p>
     <w:p>
@@ -4504,7 +4504,7 @@
           <w:sz w:val="22"/>
           <w:szCs w:val="22"/>
         </w:rPr>
-        <w:t xml:space="preserve">(≈ 2 puntos de TRD más), aunque la diferencia es pequeña frente a la variabilidad entre folds.</w:t>
+        <w:t>(≈ 1.5 puntos de TRD más en DenseNet-121 y ≈ 4 en ViT-Base/16), aunque la diferencia es pequeña frente a la variabilidad entre folds.</w:t>
       </w:r>
     </w:p>
     <w:p>
@@ -4516,7 +4516,7 @@
         <w:rPr>
           <w:rFonts w:ascii="Calibri" w:cs="Calibri" w:eastAsia="Calibri" w:hAnsi="Calibri"/>
         </w:rPr>
-        <w:t xml:space="preserve">7. Consideraciones metodológicas</w:t>
+        <w:t>7. Consideraciones metodológicas</w:t>
       </w:r>
     </w:p>
     <w:p>
@@ -4544,7 +4544,7 @@
           <w:sz w:val="22"/>
           <w:szCs w:val="22"/>
         </w:rPr>
-        <w:t xml:space="preserve">Es una adaptación supervisada (linear probe con backbone congelado), no una adaptación de dominio no supervisada. Los F1 se miden en los folds de validación del dominio objetivo (5-fold CV; StratifiedGroupKFold en Rohu para no separar casi-duplicados).</w:t>
+        <w:t>Es una adaptación supervisada (linear probe con backbone congelado), no una adaptación de dominio no supervisada. Los F1 se miden en los folds de validación del dominio objetivo (10-fold CV; StratifiedGroupKFold en Rohu para no separar casi-duplicados).</w:t>
       </w:r>
     </w:p>
     <w:p>
@@ -4572,7 +4572,7 @@
           <w:sz w:val="22"/>
           <w:szCs w:val="22"/>
         </w:rPr>
-        <w:t xml:space="preserve">La diferencia entre el peor y el mejor fold es de 7–10 puntos de F1 (ViT: Trucha 86.11 ± 4.24, Rohu 88.17 ± 2.85; DenseNet: Trucha 80.88 ± 3.58, Rohu 82.85 ± 3.68), comparable a la diferencia entre modelos.</w:t>
+        <w:t>La diferencia entre el peor y el mejor fold es de 9–17 puntos de F1 (ViT: Trucha 86.33 ± 4.75, Rohu 90.18 ± 3.08; DenseNet: Trucha 82.77 ± 3.39, Rohu 84.16 ± 4.53). Aun así, ViT-Base/16 supera a DenseNet-121 en 8 de 10 folds en Trucha (Wilcoxon pareado, p = 0.0488) y en 9 de 10 en Rohu (p = 0.0059).</w:t>
       </w:r>
     </w:p>
     <w:sectPr>

</xml_diff>